<commit_message>
Fix CV: Both jobs are previous positions, remove signature section
- IGI Vitality Insurance: Changed from 'Current' to 'Previous Position'
- Snoomart: Already marked as Previous Position
- Removed declaration and signature section for digital sending
- Updated professional summary to reflect past experience

Co-authored-by: Moeenuddin <Moeenuddin178@users.noreply.github.com>
</commit_message>
<xml_diff>
--- a/docs/Raja_Ahsan_Ali_CV.docx
+++ b/docs/Raja_Ahsan_Ali_CV.docx
@@ -58,7 +58,7 @@
         <w:spacing w:after="240"/>
       </w:pPr>
       <w:r>
-        <w:t>Motivated and reliable professional with six months of hands-on experience in Qatar. Proven ability to work efficiently in fast-paced environments with strong attention to detail and excellent coordination skills. Seeking a position as a Security Guard to contribute to maintaining safety and security standards.</w:t>
+        <w:t>Motivated and reliable professional with six months of hands-on experience in Qatar. Previously worked as a Picker at Snoomart and as a Coordinator at IGI Vitality Insurance Department. Proven ability to work efficiently in fast-paced environments with strong attention to detail and excellent coordination skills. Seeking a position as a Security Guard to contribute to maintaining safety and security standards.</w:t>
       </w:r>
     </w:p>
     <w:p>
@@ -253,7 +253,7 @@
         <w:spacing w:after="120"/>
       </w:pPr>
       <w:r>
-        <w:t>IGI Vitality Insurance Department | Qatar | Current Position</w:t>
+        <w:t>IGI Vitality Insurance Department | Qatar | Previous Position</w:t>
       </w:r>
     </w:p>
     <w:p>
@@ -262,7 +262,7 @@
         <w:ind w:left="720"/>
       </w:pPr>
       <w:r>
-        <w:t>Coordinating departmental activities and ensuring smooth operations</w:t>
+        <w:t>Coordinated departmental activities and ensured smooth operations</w:t>
       </w:r>
     </w:p>
     <w:p>
@@ -271,7 +271,7 @@
         <w:ind w:left="720"/>
       </w:pPr>
       <w:r>
-        <w:t>Handling administrative tasks and documentation</w:t>
+        <w:t>Handled administrative tasks and documentation</w:t>
       </w:r>
     </w:p>
     <w:p>
@@ -280,7 +280,7 @@
         <w:ind w:left="720"/>
       </w:pPr>
       <w:r>
-        <w:t>Communicating with clients and team members effectively</w:t>
+        <w:t>Communicated with clients and team members effectively</w:t>
       </w:r>
     </w:p>
     <w:p>
@@ -289,7 +289,7 @@
         <w:ind w:left="720"/>
       </w:pPr>
       <w:r>
-        <w:t>Managing workflow and maintaining organized records</w:t>
+        <w:t>Managed workflow and maintained organized records</w:t>
       </w:r>
     </w:p>
     <w:p>
@@ -499,20 +499,6 @@
     <w:p>
       <w:r>
         <w:t>Available upon request</w:t>
-      </w:r>
-    </w:p>
-    <w:p/>
-    <w:p>
-      <w:pPr>
-        <w:spacing w:after="480"/>
-      </w:pPr>
-      <w:r>
-        <w:t>I hereby declare that the information provided above is true and correct to the best of my knowledge.</w:t>
-      </w:r>
-    </w:p>
-    <w:p>
-      <w:r>
-        <w:t>Date: _______________                    Signature: _______________</w:t>
       </w:r>
     </w:p>
     <w:sectPr>

</xml_diff>

<commit_message>
Regenerate Word CV with profile photo embedded
The Word document now includes the profile photo in the header section

Co-authored-by: Moeenuddin <Moeenuddin178@users.noreply.github.com>
</commit_message>
<xml_diff>
--- a/docs/Raja_Ahsan_Ali_CV.docx
+++ b/docs/Raja_Ahsan_Ali_CV.docx
@@ -2,42 +2,115 @@
 <file path=word/document.xml><?xml version="1.0" encoding="utf-8"?>
 <w:document xmlns:wpc="http://schemas.microsoft.com/office/word/2010/wordprocessingCanvas" xmlns:mo="http://schemas.microsoft.com/office/mac/office/2008/main" xmlns:mc="http://schemas.openxmlformats.org/markup-compatibility/2006" xmlns:mv="urn:schemas-microsoft-com:mac:vml" xmlns:o="urn:schemas-microsoft-com:office:office" xmlns:r="http://schemas.openxmlformats.org/officeDocument/2006/relationships" xmlns:m="http://schemas.openxmlformats.org/officeDocument/2006/math" xmlns:v="urn:schemas-microsoft-com:vml" xmlns:wp14="http://schemas.microsoft.com/office/word/2010/wordprocessingDrawing" xmlns:wp="http://schemas.openxmlformats.org/drawingml/2006/wordprocessingDrawing" xmlns:w10="urn:schemas-microsoft-com:office:word" xmlns:w="http://schemas.openxmlformats.org/wordprocessingml/2006/main" xmlns:w14="http://schemas.microsoft.com/office/word/2010/wordml" xmlns:wpg="http://schemas.microsoft.com/office/word/2010/wordprocessingGroup" xmlns:wpi="http://schemas.microsoft.com/office/word/2010/wordprocessingInk" xmlns:wne="http://schemas.microsoft.com/office/word/2006/wordml" xmlns:wps="http://schemas.microsoft.com/office/word/2010/wordprocessingShape" mc:Ignorable="w14 wp14">
   <w:body>
-    <w:p>
-      <w:pPr>
+    <w:tbl>
+      <w:tblPr>
+        <w:tblW w:type="auto" w:w="0"/>
         <w:jc w:val="center"/>
-      </w:pPr>
-      <w:r>
-        <w:rPr>
-          <w:b/>
-          <w:color w:val="003366"/>
-          <w:sz w:val="48"/>
-        </w:rPr>
-        <w:t>RAJA AHSAN ALI</w:t>
-      </w:r>
-    </w:p>
-    <w:p>
-      <w:pPr>
-        <w:jc w:val="center"/>
-      </w:pPr>
-      <w:r>
-        <w:rPr>
-          <w:color w:val="646464"/>
-          <w:sz w:val="28"/>
-        </w:rPr>
-        <w:t>Security Guard</w:t>
-      </w:r>
-    </w:p>
-    <w:p>
-      <w:pPr>
-        <w:jc w:val="center"/>
-      </w:pPr>
-      <w:r>
-        <w:rPr>
-          <w:sz w:val="20"/>
-        </w:rPr>
-        <w:t>Email: ehxanali365@gmail.com  |  Phone: +974 33501566  |  Location: Alsaad Rabiea C, Qatar</w:t>
-      </w:r>
-    </w:p>
+        <w:tblLook w:firstColumn="1" w:firstRow="1" w:lastColumn="0" w:lastRow="0" w:noHBand="0" w:noVBand="1" w:val="04A0"/>
+      </w:tblPr>
+      <w:tblGrid>
+        <w:gridCol w:w="5040"/>
+        <w:gridCol w:w="5040"/>
+      </w:tblGrid>
+      <w:tr>
+        <w:tc>
+          <w:tcPr>
+            <w:tcW w:type="dxa" w:w="5040"/>
+          </w:tcPr>
+          <w:p>
+            <w:pPr>
+              <w:jc w:val="center"/>
+            </w:pPr>
+            <w:r>
+              <w:drawing>
+                <wp:inline xmlns:a="http://schemas.openxmlformats.org/drawingml/2006/main" xmlns:pic="http://schemas.openxmlformats.org/drawingml/2006/picture">
+                  <wp:extent cx="1188720" cy="1526102"/>
+                  <wp:docPr id="1" name="Picture 1"/>
+                  <wp:cNvGraphicFramePr>
+                    <a:graphicFrameLocks noChangeAspect="1"/>
+                  </wp:cNvGraphicFramePr>
+                  <a:graphic>
+                    <a:graphicData uri="http://schemas.openxmlformats.org/drawingml/2006/picture">
+                      <pic:pic>
+                        <pic:nvPicPr>
+                          <pic:cNvPr id="0" name="profile_photo.jpeg"/>
+                          <pic:cNvPicPr/>
+                        </pic:nvPicPr>
+                        <pic:blipFill>
+                          <a:blip r:embed="rId9"/>
+                          <a:stretch>
+                            <a:fillRect/>
+                          </a:stretch>
+                        </pic:blipFill>
+                        <pic:spPr>
+                          <a:xfrm>
+                            <a:off x="0" y="0"/>
+                            <a:ext cx="1188720" cy="1526102"/>
+                          </a:xfrm>
+                          <a:prstGeom prst="rect"/>
+                        </pic:spPr>
+                      </pic:pic>
+                    </a:graphicData>
+                  </a:graphic>
+                </wp:inline>
+              </w:drawing>
+            </w:r>
+          </w:p>
+        </w:tc>
+        <w:tc>
+          <w:tcPr>
+            <w:tcW w:type="dxa" w:w="5040"/>
+          </w:tcPr>
+          <w:p>
+            <w:pPr>
+              <w:jc w:val="center"/>
+            </w:pPr>
+            <w:r>
+              <w:rPr>
+                <w:b/>
+                <w:color w:val="003366"/>
+                <w:sz w:val="48"/>
+              </w:rPr>
+              <w:t>RAJA AHSAN ALI</w:t>
+            </w:r>
+          </w:p>
+          <w:p>
+            <w:pPr>
+              <w:jc w:val="center"/>
+            </w:pPr>
+            <w:r>
+              <w:rPr>
+                <w:color w:val="646464"/>
+                <w:sz w:val="28"/>
+              </w:rPr>
+              <w:t>Security Guard</w:t>
+            </w:r>
+          </w:p>
+          <w:p>
+            <w:pPr>
+              <w:jc w:val="center"/>
+            </w:pPr>
+            <w:r>
+              <w:rPr>
+                <w:sz w:val="20"/>
+              </w:rPr>
+              <w:t>Email: ehxanali365@gmail.com  |  Phone: +974 33501566</w:t>
+            </w:r>
+          </w:p>
+          <w:p>
+            <w:pPr>
+              <w:jc w:val="center"/>
+            </w:pPr>
+            <w:r>
+              <w:rPr>
+                <w:sz w:val="20"/>
+              </w:rPr>
+              <w:t>Location: Alsaad Rabiea C, Qatar</w:t>
+            </w:r>
+          </w:p>
+        </w:tc>
+      </w:tr>
+    </w:tbl>
     <w:p>
       <w:r>
         <w:t>________________________________________________________________________________</w:t>

</xml_diff>